<commit_message>
Restructure pilot brief findings as task×model score table.
Replace narrative findings with a compact table (score, composite, issue)
and a GOOGL headline-exclusion note; refresh leaderboard exports for 5-task eval.

Co-authored-by: Cursor <cursoragent@cursor.com>
</commit_message>
<xml_diff>
--- a/docs/export/ZSTATE_Pilot_Status_Brief_Jul2026.docx
+++ b/docs/export/ZSTATE_Pilot_Status_Brief_Jul2026.docx
@@ -19,7 +19,7 @@
         <w:rPr>
           <w:i/>
         </w:rPr>
-        <w:t>Work in progress — 2026-07-02 · git a638bc0</w:t>
+        <w:t>Work in progress — 2026-07-02 · git 2a20fff</w:t>
       </w:r>
     </w:p>
     <w:p>
@@ -754,20 +754,12 @@
       </w:r>
     </w:p>
     <w:p>
-      <w:pPr>
-        <w:pStyle w:val="Heading2"/>
-      </w:pPr>
-      <w:r>
-        <w:t>Full 5-task eval (pilot_eval_5task_v1)</w:t>
-      </w:r>
-    </w:p>
-    <w:p>
       <w:r>
         <w:rPr>
           <w:b w:val="0"/>
           <w:sz w:val="22"/>
         </w:rPr>
-        <w:t>Campaign pilot_eval_5task_v1: 45 runs scored (5 tasks x 3 models x 3 runs). Headline = PEP + AMZN + NFLX + KO (excl. GOOGL).</w:t>
+        <w:t>Campaign pilot_eval_5task_v1: 45 runs scored (5 tasks x 3 models x 3 runs). Score = median L1 hard-accuracy; Composite = median full L1+L2+L3 (3 runs per cell).</w:t>
       </w:r>
     </w:p>
     <w:tbl>
@@ -777,13 +769,26 @@
         <w:tblLook w:firstColumn="1" w:firstRow="1" w:lastColumn="0" w:lastRow="0" w:noHBand="0" w:noVBand="1" w:val="04A0"/>
       </w:tblPr>
       <w:tblGrid>
-        <w:gridCol w:w="4320"/>
-        <w:gridCol w:w="4320"/>
+        <w:gridCol w:w="1728"/>
+        <w:gridCol w:w="1728"/>
+        <w:gridCol w:w="1728"/>
+        <w:gridCol w:w="1728"/>
+        <w:gridCol w:w="1728"/>
       </w:tblGrid>
       <w:tr>
         <w:tc>
           <w:tcPr>
-            <w:tcW w:type="dxa" w:w="4320"/>
+            <w:tcW w:type="dxa" w:w="1728"/>
+          </w:tcPr>
+          <w:p>
+            <w:r>
+              <w:t>Task</w:t>
+            </w:r>
+          </w:p>
+        </w:tc>
+        <w:tc>
+          <w:tcPr>
+            <w:tcW w:type="dxa" w:w="1728"/>
           </w:tcPr>
           <w:p>
             <w:r>
@@ -793,11 +798,31 @@
         </w:tc>
         <w:tc>
           <w:tcPr>
-            <w:tcW w:type="dxa" w:w="4320"/>
+            <w:tcW w:type="dxa" w:w="1728"/>
           </w:tcPr>
           <w:p>
             <w:r>
-              <w:t>Headline weighted composite</w:t>
+              <w:t>Score</w:t>
+            </w:r>
+          </w:p>
+        </w:tc>
+        <w:tc>
+          <w:tcPr>
+            <w:tcW w:type="dxa" w:w="1728"/>
+          </w:tcPr>
+          <w:p>
+            <w:r>
+              <w:t>Composite</w:t>
+            </w:r>
+          </w:p>
+        </w:tc>
+        <w:tc>
+          <w:tcPr>
+            <w:tcW w:type="dxa" w:w="1728"/>
+          </w:tcPr>
+          <w:p>
+            <w:r>
+              <w:t>Issue</w:t>
             </w:r>
           </w:p>
         </w:tc>
@@ -805,7 +830,17 @@
       <w:tr>
         <w:tc>
           <w:tcPr>
-            <w:tcW w:type="dxa" w:w="4320"/>
+            <w:tcW w:type="dxa" w:w="1728"/>
+          </w:tcPr>
+          <w:p>
+            <w:r>
+              <w:t>GOOGL segment sum (ceiling) *</w:t>
+            </w:r>
+          </w:p>
+        </w:tc>
+        <w:tc>
+          <w:tcPr>
+            <w:tcW w:type="dxa" w:w="1728"/>
           </w:tcPr>
           <w:p>
             <w:r>
@@ -815,11 +850,31 @@
         </w:tc>
         <w:tc>
           <w:tcPr>
-            <w:tcW w:type="dxa" w:w="4320"/>
+            <w:tcW w:type="dxa" w:w="1728"/>
           </w:tcPr>
           <w:p>
             <w:r>
-              <w:t>0.994</w:t>
+              <w:t>1.000</w:t>
+            </w:r>
+          </w:p>
+        </w:tc>
+        <w:tc>
+          <w:tcPr>
+            <w:tcW w:type="dxa" w:w="1728"/>
+          </w:tcPr>
+          <w:p>
+            <w:r>
+              <w:t>1.000</w:t>
+            </w:r>
+          </w:p>
+        </w:tc>
+        <w:tc>
+          <w:tcPr>
+            <w:tcW w:type="dxa" w:w="1728"/>
+          </w:tcPr>
+          <w:p>
+            <w:r>
+              <w:t>None</w:t>
             </w:r>
           </w:p>
         </w:tc>
@@ -827,7 +882,17 @@
       <w:tr>
         <w:tc>
           <w:tcPr>
-            <w:tcW w:type="dxa" w:w="4320"/>
+            <w:tcW w:type="dxa" w:w="1728"/>
+          </w:tcPr>
+          <w:p>
+            <w:r>
+              <w:t>GOOGL segment sum (ceiling) *</w:t>
+            </w:r>
+          </w:p>
+        </w:tc>
+        <w:tc>
+          <w:tcPr>
+            <w:tcW w:type="dxa" w:w="1728"/>
           </w:tcPr>
           <w:p>
             <w:r>
@@ -837,11 +902,31 @@
         </w:tc>
         <w:tc>
           <w:tcPr>
-            <w:tcW w:type="dxa" w:w="4320"/>
+            <w:tcW w:type="dxa" w:w="1728"/>
           </w:tcPr>
           <w:p>
             <w:r>
-              <w:t>0.982</w:t>
+              <w:t>1.000</w:t>
+            </w:r>
+          </w:p>
+        </w:tc>
+        <w:tc>
+          <w:tcPr>
+            <w:tcW w:type="dxa" w:w="1728"/>
+          </w:tcPr>
+          <w:p>
+            <w:r>
+              <w:t>1.000</w:t>
+            </w:r>
+          </w:p>
+        </w:tc>
+        <w:tc>
+          <w:tcPr>
+            <w:tcW w:type="dxa" w:w="1728"/>
+          </w:tcPr>
+          <w:p>
+            <w:r>
+              <w:t>None</w:t>
             </w:r>
           </w:p>
         </w:tc>
@@ -849,7 +934,17 @@
       <w:tr>
         <w:tc>
           <w:tcPr>
-            <w:tcW w:type="dxa" w:w="4320"/>
+            <w:tcW w:type="dxa" w:w="1728"/>
+          </w:tcPr>
+          <w:p>
+            <w:r>
+              <w:t>GOOGL segment sum (ceiling) *</w:t>
+            </w:r>
+          </w:p>
+        </w:tc>
+        <w:tc>
+          <w:tcPr>
+            <w:tcW w:type="dxa" w:w="1728"/>
           </w:tcPr>
           <w:p>
             <w:r>
@@ -859,93 +954,7 @@
         </w:tc>
         <w:tc>
           <w:tcPr>
-            <w:tcW w:type="dxa" w:w="4320"/>
-          </w:tcPr>
-          <w:p>
-            <w:r>
-              <w:t>0.896</w:t>
-            </w:r>
-          </w:p>
-        </w:tc>
-      </w:tr>
-    </w:tbl>
-    <w:p>
-      <w:r>
-        <w:rPr>
-          <w:b/>
-          <w:sz w:val="22"/>
-        </w:rPr>
-        <w:t>Per-task medians by model:</w:t>
-      </w:r>
-    </w:p>
-    <w:tbl>
-      <w:tblPr>
-        <w:tblStyle w:val="TableGrid"/>
-        <w:tblW w:type="auto" w:w="0"/>
-        <w:tblLook w:firstColumn="1" w:firstRow="1" w:lastColumn="0" w:lastRow="0" w:noHBand="0" w:noVBand="1" w:val="04A0"/>
-      </w:tblPr>
-      <w:tblGrid>
-        <w:gridCol w:w="2160"/>
-        <w:gridCol w:w="2160"/>
-        <w:gridCol w:w="2160"/>
-        <w:gridCol w:w="2160"/>
-      </w:tblGrid>
-      <w:tr>
-        <w:tc>
-          <w:tcPr>
-            <w:tcW w:type="dxa" w:w="2160"/>
-          </w:tcPr>
-          <w:p>
-            <w:r>
-              <w:t>Task</w:t>
-            </w:r>
-          </w:p>
-        </w:tc>
-        <w:tc>
-          <w:tcPr>
-            <w:tcW w:type="dxa" w:w="2160"/>
-          </w:tcPr>
-          <w:p>
-            <w:r>
-              <w:t>claude sonnet 4 5</w:t>
-            </w:r>
-          </w:p>
-        </w:tc>
-        <w:tc>
-          <w:tcPr>
-            <w:tcW w:type="dxa" w:w="2160"/>
-          </w:tcPr>
-          <w:p>
-            <w:r>
-              <w:t>gemini 2.5 flash</w:t>
-            </w:r>
-          </w:p>
-        </w:tc>
-        <w:tc>
-          <w:tcPr>
-            <w:tcW w:type="dxa" w:w="2160"/>
-          </w:tcPr>
-          <w:p>
-            <w:r>
-              <w:t>gpt 4o</w:t>
-            </w:r>
-          </w:p>
-        </w:tc>
-      </w:tr>
-      <w:tr>
-        <w:tc>
-          <w:tcPr>
-            <w:tcW w:type="dxa" w:w="2160"/>
-          </w:tcPr>
-          <w:p>
-            <w:r>
-              <w:t>AMZN footnote reconciliation</w:t>
-            </w:r>
-          </w:p>
-        </w:tc>
-        <w:tc>
-          <w:tcPr>
-            <w:tcW w:type="dxa" w:w="2160"/>
+            <w:tcW w:type="dxa" w:w="1728"/>
           </w:tcPr>
           <w:p>
             <w:r>
@@ -955,7 +964,7 @@
         </w:tc>
         <w:tc>
           <w:tcPr>
-            <w:tcW w:type="dxa" w:w="2160"/>
+            <w:tcW w:type="dxa" w:w="1728"/>
           </w:tcPr>
           <w:p>
             <w:r>
@@ -965,11 +974,11 @@
         </w:tc>
         <w:tc>
           <w:tcPr>
-            <w:tcW w:type="dxa" w:w="2160"/>
+            <w:tcW w:type="dxa" w:w="1728"/>
           </w:tcPr>
           <w:p>
             <w:r>
-              <w:t>0.958</w:t>
+              <w:t>None</w:t>
             </w:r>
           </w:p>
         </w:tc>
@@ -977,17 +986,27 @@
       <w:tr>
         <w:tc>
           <w:tcPr>
-            <w:tcW w:type="dxa" w:w="2160"/>
+            <w:tcW w:type="dxa" w:w="1728"/>
           </w:tcPr>
           <w:p>
             <w:r>
-              <w:t>GOOGL footnote reconciliation</w:t>
+              <w:t>PEP FX / organic growth</w:t>
             </w:r>
           </w:p>
         </w:tc>
         <w:tc>
           <w:tcPr>
-            <w:tcW w:type="dxa" w:w="2160"/>
+            <w:tcW w:type="dxa" w:w="1728"/>
+          </w:tcPr>
+          <w:p>
+            <w:r>
+              <w:t>claude-sonnet-4-5</w:t>
+            </w:r>
+          </w:p>
+        </w:tc>
+        <w:tc>
+          <w:tcPr>
+            <w:tcW w:type="dxa" w:w="1728"/>
           </w:tcPr>
           <w:p>
             <w:r>
@@ -997,7 +1016,7 @@
         </w:tc>
         <w:tc>
           <w:tcPr>
-            <w:tcW w:type="dxa" w:w="2160"/>
+            <w:tcW w:type="dxa" w:w="1728"/>
           </w:tcPr>
           <w:p>
             <w:r>
@@ -1007,11 +1026,11 @@
         </w:tc>
         <w:tc>
           <w:tcPr>
-            <w:tcW w:type="dxa" w:w="2160"/>
+            <w:tcW w:type="dxa" w:w="1728"/>
           </w:tcPr>
           <w:p>
             <w:r>
-              <w:t>1.000</w:t>
+              <w:t>None</w:t>
             </w:r>
           </w:p>
         </w:tc>
@@ -1019,17 +1038,27 @@
       <w:tr>
         <w:tc>
           <w:tcPr>
-            <w:tcW w:type="dxa" w:w="2160"/>
+            <w:tcW w:type="dxa" w:w="1728"/>
           </w:tcPr>
           <w:p>
             <w:r>
-              <w:t>KO footnote reconciliation</w:t>
+              <w:t>PEP FX / organic growth</w:t>
             </w:r>
           </w:p>
         </w:tc>
         <w:tc>
           <w:tcPr>
-            <w:tcW w:type="dxa" w:w="2160"/>
+            <w:tcW w:type="dxa" w:w="1728"/>
+          </w:tcPr>
+          <w:p>
+            <w:r>
+              <w:t>gemini-2.5-flash</w:t>
+            </w:r>
+          </w:p>
+        </w:tc>
+        <w:tc>
+          <w:tcPr>
+            <w:tcW w:type="dxa" w:w="1728"/>
           </w:tcPr>
           <w:p>
             <w:r>
@@ -1039,7 +1068,7 @@
         </w:tc>
         <w:tc>
           <w:tcPr>
-            <w:tcW w:type="dxa" w:w="2160"/>
+            <w:tcW w:type="dxa" w:w="1728"/>
           </w:tcPr>
           <w:p>
             <w:r>
@@ -1049,11 +1078,11 @@
         </w:tc>
         <w:tc>
           <w:tcPr>
-            <w:tcW w:type="dxa" w:w="2160"/>
+            <w:tcW w:type="dxa" w:w="1728"/>
           </w:tcPr>
           <w:p>
             <w:r>
-              <w:t>0.884</w:t>
+              <w:t>Citation snippet not in bundle excerpt (CITE_HALLUC)</w:t>
             </w:r>
           </w:p>
         </w:tc>
@@ -1061,7 +1090,215 @@
       <w:tr>
         <w:tc>
           <w:tcPr>
-            <w:tcW w:type="dxa" w:w="2160"/>
+            <w:tcW w:type="dxa" w:w="1728"/>
+          </w:tcPr>
+          <w:p>
+            <w:r>
+              <w:t>PEP FX / organic growth</w:t>
+            </w:r>
+          </w:p>
+        </w:tc>
+        <w:tc>
+          <w:tcPr>
+            <w:tcW w:type="dxa" w:w="1728"/>
+          </w:tcPr>
+          <w:p>
+            <w:r>
+              <w:t>gpt-4o</w:t>
+            </w:r>
+          </w:p>
+        </w:tc>
+        <w:tc>
+          <w:tcPr>
+            <w:tcW w:type="dxa" w:w="1728"/>
+          </w:tcPr>
+          <w:p>
+            <w:r>
+              <w:t>1.000</w:t>
+            </w:r>
+          </w:p>
+        </w:tc>
+        <w:tc>
+          <w:tcPr>
+            <w:tcW w:type="dxa" w:w="1728"/>
+          </w:tcPr>
+          <w:p>
+            <w:r>
+              <w:t>0.864</w:t>
+            </w:r>
+          </w:p>
+        </w:tc>
+        <w:tc>
+          <w:tcPr>
+            <w:tcW w:type="dxa" w:w="1728"/>
+          </w:tcPr>
+          <w:p>
+            <w:r>
+              <w:t>Citation snippet not in bundle excerpt (CITE_HALLUC); Non-auditable citation (CITE_BROAD)</w:t>
+            </w:r>
+          </w:p>
+        </w:tc>
+      </w:tr>
+      <w:tr>
+        <w:tc>
+          <w:tcPr>
+            <w:tcW w:type="dxa" w:w="1728"/>
+          </w:tcPr>
+          <w:p>
+            <w:r>
+              <w:t>AMZN segment bridge</w:t>
+            </w:r>
+          </w:p>
+        </w:tc>
+        <w:tc>
+          <w:tcPr>
+            <w:tcW w:type="dxa" w:w="1728"/>
+          </w:tcPr>
+          <w:p>
+            <w:r>
+              <w:t>claude-sonnet-4-5</w:t>
+            </w:r>
+          </w:p>
+        </w:tc>
+        <w:tc>
+          <w:tcPr>
+            <w:tcW w:type="dxa" w:w="1728"/>
+          </w:tcPr>
+          <w:p>
+            <w:r>
+              <w:t>1.000</w:t>
+            </w:r>
+          </w:p>
+        </w:tc>
+        <w:tc>
+          <w:tcPr>
+            <w:tcW w:type="dxa" w:w="1728"/>
+          </w:tcPr>
+          <w:p>
+            <w:r>
+              <w:t>1.000</w:t>
+            </w:r>
+          </w:p>
+        </w:tc>
+        <w:tc>
+          <w:tcPr>
+            <w:tcW w:type="dxa" w:w="1728"/>
+          </w:tcPr>
+          <w:p>
+            <w:r>
+              <w:t>None</w:t>
+            </w:r>
+          </w:p>
+        </w:tc>
+      </w:tr>
+      <w:tr>
+        <w:tc>
+          <w:tcPr>
+            <w:tcW w:type="dxa" w:w="1728"/>
+          </w:tcPr>
+          <w:p>
+            <w:r>
+              <w:t>AMZN segment bridge</w:t>
+            </w:r>
+          </w:p>
+        </w:tc>
+        <w:tc>
+          <w:tcPr>
+            <w:tcW w:type="dxa" w:w="1728"/>
+          </w:tcPr>
+          <w:p>
+            <w:r>
+              <w:t>gemini-2.5-flash</w:t>
+            </w:r>
+          </w:p>
+        </w:tc>
+        <w:tc>
+          <w:tcPr>
+            <w:tcW w:type="dxa" w:w="1728"/>
+          </w:tcPr>
+          <w:p>
+            <w:r>
+              <w:t>1.000</w:t>
+            </w:r>
+          </w:p>
+        </w:tc>
+        <w:tc>
+          <w:tcPr>
+            <w:tcW w:type="dxa" w:w="1728"/>
+          </w:tcPr>
+          <w:p>
+            <w:r>
+              <w:t>1.000</w:t>
+            </w:r>
+          </w:p>
+        </w:tc>
+        <w:tc>
+          <w:tcPr>
+            <w:tcW w:type="dxa" w:w="1728"/>
+          </w:tcPr>
+          <w:p>
+            <w:r>
+              <w:t>None</w:t>
+            </w:r>
+          </w:p>
+        </w:tc>
+      </w:tr>
+      <w:tr>
+        <w:tc>
+          <w:tcPr>
+            <w:tcW w:type="dxa" w:w="1728"/>
+          </w:tcPr>
+          <w:p>
+            <w:r>
+              <w:t>AMZN segment bridge</w:t>
+            </w:r>
+          </w:p>
+        </w:tc>
+        <w:tc>
+          <w:tcPr>
+            <w:tcW w:type="dxa" w:w="1728"/>
+          </w:tcPr>
+          <w:p>
+            <w:r>
+              <w:t>gpt-4o</w:t>
+            </w:r>
+          </w:p>
+        </w:tc>
+        <w:tc>
+          <w:tcPr>
+            <w:tcW w:type="dxa" w:w="1728"/>
+          </w:tcPr>
+          <w:p>
+            <w:r>
+              <w:t>1.000</w:t>
+            </w:r>
+          </w:p>
+        </w:tc>
+        <w:tc>
+          <w:tcPr>
+            <w:tcW w:type="dxa" w:w="1728"/>
+          </w:tcPr>
+          <w:p>
+            <w:r>
+              <w:t>0.958</w:t>
+            </w:r>
+          </w:p>
+        </w:tc>
+        <w:tc>
+          <w:tcPr>
+            <w:tcW w:type="dxa" w:w="1728"/>
+          </w:tcPr>
+          <w:p>
+            <w:r>
+              <w:t>Non-auditable citation (CITE_BROAD)</w:t>
+            </w:r>
+          </w:p>
+        </w:tc>
+      </w:tr>
+      <w:tr>
+        <w:tc>
+          <w:tcPr>
+            <w:tcW w:type="dxa" w:w="1728"/>
           </w:tcPr>
           <w:p>
             <w:r>
@@ -1071,7 +1308,27 @@
         </w:tc>
         <w:tc>
           <w:tcPr>
-            <w:tcW w:type="dxa" w:w="2160"/>
+            <w:tcW w:type="dxa" w:w="1728"/>
+          </w:tcPr>
+          <w:p>
+            <w:r>
+              <w:t>claude-sonnet-4-5</w:t>
+            </w:r>
+          </w:p>
+        </w:tc>
+        <w:tc>
+          <w:tcPr>
+            <w:tcW w:type="dxa" w:w="1728"/>
+          </w:tcPr>
+          <w:p>
+            <w:r>
+              <w:t>1.000</w:t>
+            </w:r>
+          </w:p>
+        </w:tc>
+        <w:tc>
+          <w:tcPr>
+            <w:tcW w:type="dxa" w:w="1728"/>
           </w:tcPr>
           <w:p>
             <w:r>
@@ -1081,7 +1338,49 @@
         </w:tc>
         <w:tc>
           <w:tcPr>
-            <w:tcW w:type="dxa" w:w="2160"/>
+            <w:tcW w:type="dxa" w:w="1728"/>
+          </w:tcPr>
+          <w:p>
+            <w:r>
+              <w:t>Non-auditable citation (CITE_BROAD); Citation snippet not in bundle excerpt (CITE_HALLUC)</w:t>
+            </w:r>
+          </w:p>
+        </w:tc>
+      </w:tr>
+      <w:tr>
+        <w:tc>
+          <w:tcPr>
+            <w:tcW w:type="dxa" w:w="1728"/>
+          </w:tcPr>
+          <w:p>
+            <w:r>
+              <w:t>NFLX guidance drift</w:t>
+            </w:r>
+          </w:p>
+        </w:tc>
+        <w:tc>
+          <w:tcPr>
+            <w:tcW w:type="dxa" w:w="1728"/>
+          </w:tcPr>
+          <w:p>
+            <w:r>
+              <w:t>gemini-2.5-flash</w:t>
+            </w:r>
+          </w:p>
+        </w:tc>
+        <w:tc>
+          <w:tcPr>
+            <w:tcW w:type="dxa" w:w="1728"/>
+          </w:tcPr>
+          <w:p>
+            <w:r>
+              <w:t>1.000</w:t>
+            </w:r>
+          </w:p>
+        </w:tc>
+        <w:tc>
+          <w:tcPr>
+            <w:tcW w:type="dxa" w:w="1728"/>
           </w:tcPr>
           <w:p>
             <w:r>
@@ -1091,11 +1390,11 @@
         </w:tc>
         <w:tc>
           <w:tcPr>
-            <w:tcW w:type="dxa" w:w="2160"/>
+            <w:tcW w:type="dxa" w:w="1728"/>
           </w:tcPr>
           <w:p>
             <w:r>
-              <w:t>0.879</w:t>
+              <w:t>Non-auditable citation (CITE_BROAD)</w:t>
             </w:r>
           </w:p>
         </w:tc>
@@ -1103,17 +1402,27 @@
       <w:tr>
         <w:tc>
           <w:tcPr>
-            <w:tcW w:type="dxa" w:w="2160"/>
+            <w:tcW w:type="dxa" w:w="1728"/>
           </w:tcPr>
           <w:p>
             <w:r>
-              <w:t>PEP fx organic growth</w:t>
+              <w:t>NFLX guidance drift</w:t>
             </w:r>
           </w:p>
         </w:tc>
         <w:tc>
           <w:tcPr>
-            <w:tcW w:type="dxa" w:w="2160"/>
+            <w:tcW w:type="dxa" w:w="1728"/>
+          </w:tcPr>
+          <w:p>
+            <w:r>
+              <w:t>gpt-4o</w:t>
+            </w:r>
+          </w:p>
+        </w:tc>
+        <w:tc>
+          <w:tcPr>
+            <w:tcW w:type="dxa" w:w="1728"/>
           </w:tcPr>
           <w:p>
             <w:r>
@@ -1123,7 +1432,49 @@
         </w:tc>
         <w:tc>
           <w:tcPr>
-            <w:tcW w:type="dxa" w:w="2160"/>
+            <w:tcW w:type="dxa" w:w="1728"/>
+          </w:tcPr>
+          <w:p>
+            <w:r>
+              <w:t>0.879</w:t>
+            </w:r>
+          </w:p>
+        </w:tc>
+        <w:tc>
+          <w:tcPr>
+            <w:tcW w:type="dxa" w:w="1728"/>
+          </w:tcPr>
+          <w:p>
+            <w:r>
+              <w:t>Non-auditable citation (CITE_BROAD)</w:t>
+            </w:r>
+          </w:p>
+        </w:tc>
+      </w:tr>
+      <w:tr>
+        <w:tc>
+          <w:tcPr>
+            <w:tcW w:type="dxa" w:w="1728"/>
+          </w:tcPr>
+          <w:p>
+            <w:r>
+              <w:t>KO segment bridge</w:t>
+            </w:r>
+          </w:p>
+        </w:tc>
+        <w:tc>
+          <w:tcPr>
+            <w:tcW w:type="dxa" w:w="1728"/>
+          </w:tcPr>
+          <w:p>
+            <w:r>
+              <w:t>claude-sonnet-4-5</w:t>
+            </w:r>
+          </w:p>
+        </w:tc>
+        <w:tc>
+          <w:tcPr>
+            <w:tcW w:type="dxa" w:w="1728"/>
           </w:tcPr>
           <w:p>
             <w:r>
@@ -1133,11 +1484,125 @@
         </w:tc>
         <w:tc>
           <w:tcPr>
-            <w:tcW w:type="dxa" w:w="2160"/>
+            <w:tcW w:type="dxa" w:w="1728"/>
           </w:tcPr>
           <w:p>
             <w:r>
-              <w:t>0.864</w:t>
+              <w:t>1.000</w:t>
+            </w:r>
+          </w:p>
+        </w:tc>
+        <w:tc>
+          <w:tcPr>
+            <w:tcW w:type="dxa" w:w="1728"/>
+          </w:tcPr>
+          <w:p>
+            <w:r>
+              <w:t>Citation snippet not in bundle excerpt (CITE_HALLUC)</w:t>
+            </w:r>
+          </w:p>
+        </w:tc>
+      </w:tr>
+      <w:tr>
+        <w:tc>
+          <w:tcPr>
+            <w:tcW w:type="dxa" w:w="1728"/>
+          </w:tcPr>
+          <w:p>
+            <w:r>
+              <w:t>KO segment bridge</w:t>
+            </w:r>
+          </w:p>
+        </w:tc>
+        <w:tc>
+          <w:tcPr>
+            <w:tcW w:type="dxa" w:w="1728"/>
+          </w:tcPr>
+          <w:p>
+            <w:r>
+              <w:t>gemini-2.5-flash</w:t>
+            </w:r>
+          </w:p>
+        </w:tc>
+        <w:tc>
+          <w:tcPr>
+            <w:tcW w:type="dxa" w:w="1728"/>
+          </w:tcPr>
+          <w:p>
+            <w:r>
+              <w:t>1.000</w:t>
+            </w:r>
+          </w:p>
+        </w:tc>
+        <w:tc>
+          <w:tcPr>
+            <w:tcW w:type="dxa" w:w="1728"/>
+          </w:tcPr>
+          <w:p>
+            <w:r>
+              <w:t>1.000</w:t>
+            </w:r>
+          </w:p>
+        </w:tc>
+        <w:tc>
+          <w:tcPr>
+            <w:tcW w:type="dxa" w:w="1728"/>
+          </w:tcPr>
+          <w:p>
+            <w:r>
+              <w:t>Non-auditable citation (CITE_BROAD)</w:t>
+            </w:r>
+          </w:p>
+        </w:tc>
+      </w:tr>
+      <w:tr>
+        <w:tc>
+          <w:tcPr>
+            <w:tcW w:type="dxa" w:w="1728"/>
+          </w:tcPr>
+          <w:p>
+            <w:r>
+              <w:t>KO segment bridge</w:t>
+            </w:r>
+          </w:p>
+        </w:tc>
+        <w:tc>
+          <w:tcPr>
+            <w:tcW w:type="dxa" w:w="1728"/>
+          </w:tcPr>
+          <w:p>
+            <w:r>
+              <w:t>gpt-4o</w:t>
+            </w:r>
+          </w:p>
+        </w:tc>
+        <w:tc>
+          <w:tcPr>
+            <w:tcW w:type="dxa" w:w="1728"/>
+          </w:tcPr>
+          <w:p>
+            <w:r>
+              <w:t>1.000</w:t>
+            </w:r>
+          </w:p>
+        </w:tc>
+        <w:tc>
+          <w:tcPr>
+            <w:tcW w:type="dxa" w:w="1728"/>
+          </w:tcPr>
+          <w:p>
+            <w:r>
+              <w:t>0.884</w:t>
+            </w:r>
+          </w:p>
+        </w:tc>
+        <w:tc>
+          <w:tcPr>
+            <w:tcW w:type="dxa" w:w="1728"/>
+          </w:tcPr>
+          <w:p>
+            <w:r>
+              <w:t>Non-auditable citation (CITE_BROAD)</w:t>
             </w:r>
           </w:p>
         </w:tc>
@@ -1149,48 +1614,16 @@
           <w:b w:val="0"/>
           <w:sz w:val="22"/>
         </w:rPr>
-        <w:t>Fractures (all runs): {'CITE_HALLUC': 6, 'CITE_BROAD': 16}</w:t>
+        <w:t>* Not in headline rank (see note below).</w:t>
       </w:r>
     </w:p>
     <w:p>
       <w:r>
         <w:rPr>
-          <w:b/>
+          <w:b w:val="0"/>
           <w:sz w:val="22"/>
         </w:rPr>
-        <w:t>Interpretation:</w:t>
-      </w:r>
-    </w:p>
-    <w:p>
-      <w:pPr>
-        <w:pStyle w:val="ListBullet"/>
-      </w:pPr>
-      <w:r>
-        <w:t>KO_footnote_reconciliation is the universal gap — all three models median 0.0 on headline.</w:t>
-      </w:r>
-    </w:p>
-    <w:p>
-      <w:pPr>
-        <w:pStyle w:val="ListBullet"/>
-      </w:pPr>
-      <w:r>
-        <w:t>Claude leads headline (0.744); Gemini close second (0.732); GPT-4o third (0.675).</w:t>
-      </w:r>
-    </w:p>
-    <w:p>
-      <w:pPr>
-        <w:pStyle w:val="ListBullet"/>
-      </w:pPr>
-      <w:r>
-        <w:t>GOOGL ceiling task: all models median 1.0 on 3 runs.</w:t>
-      </w:r>
-    </w:p>
-    <w:p>
-      <w:pPr>
-        <w:pStyle w:val="ListBullet"/>
-      </w:pPr>
-      <w:r>
-        <w:t>L3 citation fractures (CITE_BROAD, CITE_HALLUC) dominate; KO adds HALLUC_FILL on L1.</w:t>
+        <w:t>Why GOOGL is scored but excluded from headline rank: GOOGL_footnote_reconciliation is included in the full 5-task campaign as a ceiling check — all three models median 1.0 on L1, path recall, and composite across three runs, so it no longer separates frontier performers. Headline rank therefore uses PEP, AMZN, NFLX, and KO, where citation quality (CITE_BROAD, CITE_HALLUC) and task-specific traps still produce meaningful spread (Claude 0.994 vs GPT-4o 0.896 in this pilot).</w:t>
       </w:r>
     </w:p>
     <w:p>
@@ -1214,7 +1647,7 @@
         <w:pStyle w:val="ListBullet"/>
       </w:pPr>
       <w:r>
-        <w:t>Investigate KO metric schema confusion (wrong submit keys observed on Gemini).</w:t>
+        <w:t>Tighten L3 citation rules or eval-mode prompts — CITE_BROAD is the main separator on headline tasks.</w:t>
       </w:r>
     </w:p>
     <w:p>

</xml_diff>

<commit_message>
Pin post-9B L3 rescore for the 5-task pilot eval.
Re-score existing runs under hardened citation rules, refresh leaderboard
and status brief, and ungate P3-03 from optional mock-agent work.

Co-authored-by: Cursor <cursoragent@cursor.com>
</commit_message>
<xml_diff>
--- a/docs/export/ZSTATE_Pilot_Status_Brief_Jul2026.docx
+++ b/docs/export/ZSTATE_Pilot_Status_Brief_Jul2026.docx
@@ -19,7 +19,7 @@
         <w:rPr>
           <w:i/>
         </w:rPr>
-        <w:t>Work in progress — 2026-07-02 · git 2a20fff</w:t>
+        <w:t>Work in progress — 2026-07-02 · git 1208d81</w:t>
       </w:r>
     </w:p>
     <w:p>
@@ -1332,7 +1332,7 @@
           </w:tcPr>
           <w:p>
             <w:r>
-              <w:t>0.976</w:t>
+              <w:t>0.879</w:t>
             </w:r>
           </w:p>
         </w:tc>
@@ -1342,7 +1342,7 @@
           </w:tcPr>
           <w:p>
             <w:r>
-              <w:t>Non-auditable citation (CITE_BROAD); Citation snippet not in bundle excerpt (CITE_HALLUC)</w:t>
+              <w:t>Citation snippet not in bundle excerpt (CITE_HALLUC); Non-auditable citation (CITE_BROAD)</w:t>
             </w:r>
           </w:p>
         </w:tc>
@@ -1384,7 +1384,7 @@
           </w:tcPr>
           <w:p>
             <w:r>
-              <w:t>0.927</w:t>
+              <w:t>0.830</w:t>
             </w:r>
           </w:p>
         </w:tc>
@@ -1394,7 +1394,7 @@
           </w:tcPr>
           <w:p>
             <w:r>
-              <w:t>Non-auditable citation (CITE_BROAD)</w:t>
+              <w:t>Non-auditable citation (CITE_BROAD); Citation snippet not in bundle excerpt (CITE_HALLUC); +1 more</w:t>
             </w:r>
           </w:p>
         </w:tc>
@@ -1436,7 +1436,7 @@
           </w:tcPr>
           <w:p>
             <w:r>
-              <w:t>0.879</w:t>
+              <w:t>0.830</w:t>
             </w:r>
           </w:p>
         </w:tc>
@@ -1446,7 +1446,7 @@
           </w:tcPr>
           <w:p>
             <w:r>
-              <w:t>Non-auditable citation (CITE_BROAD)</w:t>
+              <w:t>Citation snippet not in bundle excerpt (CITE_HALLUC); Non-auditable citation (CITE_BROAD)</w:t>
             </w:r>
           </w:p>
         </w:tc>
@@ -1488,7 +1488,7 @@
           </w:tcPr>
           <w:p>
             <w:r>
-              <w:t>1.000</w:t>
+              <w:t>0.896</w:t>
             </w:r>
           </w:p>
         </w:tc>
@@ -1540,7 +1540,7 @@
           </w:tcPr>
           <w:p>
             <w:r>
-              <w:t>1.000</w:t>
+              <w:t>0.873</w:t>
             </w:r>
           </w:p>
         </w:tc>
@@ -1592,7 +1592,7 @@
           </w:tcPr>
           <w:p>
             <w:r>
-              <w:t>0.884</w:t>
+              <w:t>0.873</w:t>
             </w:r>
           </w:p>
         </w:tc>

</xml_diff>

<commit_message>
Run synthetic L3 diagnostic campaign and refresh pilot docs for v0.2.
pilot_eval_5task_synthetic_l3_v1: 5 tasks x 3 models x 1 run with decoy
baits on — zero bait citations across 14 evaluated runs, so synthetic FI
is a robustness checkmark, not a ranking dimension. Official pin stays
pilot_eval_5task_v1; diagnostic aggregate + leaderboard committed via
gitignore exception.

Fix OpenAI adapter to defer retrieval nudge until all parallel tool_call_ids
are answered (400 invalid_request on 2 gpt-4o slots otherwise).

PILOT_EVAL_JUL2026.md rewritten for the pinned 5-task baseline; status
brief regenerated with v0.2 anchors + synthetic finding. Backlog hygiene:
scale-pass workflow in How-to-use, LATER-05 partial, SH-12 count,
defer-until-task-8-10 table.

Co-authored-by: Cursor <cursoragent@cursor.com>
</commit_message>
<xml_diff>
--- a/docs/export/ZSTATE_Pilot_Status_Brief_Jul2026.docx
+++ b/docs/export/ZSTATE_Pilot_Status_Brief_Jul2026.docx
@@ -19,7 +19,7 @@
         <w:rPr>
           <w:i/>
         </w:rPr>
-        <w:t>Work in progress — 2026-07-02 · git 1208d81</w:t>
+        <w:t>Work in progress — 2026-07-03 · git d55c5f1</w:t>
       </w:r>
     </w:p>
     <w:p>
@@ -686,7 +686,7 @@
         <w:pStyle w:val="ListBullet"/>
       </w:pPr>
       <w:r>
-        <w:t>KO (F, new): FY2025 five-segment Total net revenues + Corporate + Eliminations bridge to $47,941M consolidated; LatAm (2)% total vs (12)% FX from MD&amp;A.</w:t>
+        <w:t>KO (F, new): FY2025 five-segment Total net revenues + Corporate + Eliminations bridge to $47,941M consolidated (reconciliation_bridge_total, v0.2 naming); LatAm (2)% total vs (12)% FX from MD&amp;A.</w:t>
       </w:r>
     </w:p>
     <w:p>
@@ -743,6 +743,22 @@
       </w:pPr>
       <w:r>
         <w:t>3 runs per task (median) for all models in pilot_eval_5task_v1.</w:t>
+      </w:r>
+    </w:p>
+    <w:p>
+      <w:pPr>
+        <w:pStyle w:val="ListBullet"/>
+      </w:pPr>
+      <w:r>
+        <w:t>v0.2 L3 anchors: ground-truth-derived row/column anchors with token-set matching; anchor regression + schema coherence gates in CI.</w:t>
+      </w:r>
+    </w:p>
+    <w:p>
+      <w:pPr>
+        <w:pStyle w:val="ListBullet"/>
+      </w:pPr>
+      <w:r>
+        <w:t>Synthetic L3 decoy diagnostic (Jul 3): 0 bait citations across 14 evaluated runs, 3 models — robustness checkmark, not yet a ranking dimension.</w:t>
       </w:r>
     </w:p>
     <w:p>
@@ -1639,6 +1655,14 @@
         <w:pStyle w:val="ListBullet"/>
       </w:pPr>
       <w:r>
+        <w:t>Task #6 via scaffold_task.py — publish gate now includes task schema coherence (P3-37).</w:t>
+      </w:r>
+    </w:p>
+    <w:p>
+      <w:pPr>
+        <w:pStyle w:val="ListBullet"/>
+      </w:pPr>
+      <w:r>
         <w:t>Scale to 15-task MVD (5 companies x 3 task types) with expert sign-off pipeline.</w:t>
       </w:r>
     </w:p>
@@ -1655,7 +1679,7 @@
         <w:pStyle w:val="ListBullet"/>
       </w:pPr>
       <w:r>
-        <w:t>Track B: more frontier trajectories + PM branch coverage.</w:t>
+        <w:t>Synthetic L3 at 3x runs / harder decoys before treating it as a ranking dimension.</w:t>
       </w:r>
     </w:p>
     <w:p>
@@ -1663,7 +1687,7 @@
         <w:pStyle w:val="ListBullet"/>
       </w:pPr>
       <w:r>
-        <w:t>Expert Workbench (spec) for CFA draft -&gt; review -&gt; publish workflow.</w:t>
+        <w:t>Track B: more frontier trajectories + PM branch coverage.</w:t>
       </w:r>
     </w:p>
     <w:p>

</xml_diff>